<commit_message>
Add editable office profile to the CNSS facturation bill
The office letterhead (name AR/FR, phone, fax, MF, RIB, CNSS) now appears
at the top of the monthly bill and is editable from Settings.

- services/officeProfile.js + settings.js: GET/PUT /settings/office/profile
  over app_settings (bulk PUT allows empty values so a field can be cleared).
- listRender.js + cnss.js: the monthly list merges the saved office_* fields;
  city falls back to سوسة when blank.
- template_list.docx: centered letterhead block with the {office_*} merge
  tags, injected via add_office_header_to_list_template.js (idempotent).
- Settings.jsx: «بيانات المكتب» card to edit the 8 fields.

Co-Authored-By: Claude Opus 4.8 <noreply@anthropic.com>
</commit_message>
<xml_diff>
--- a/server/assets/template_list.docx
+++ b/server/assets/template_list.docx
@@ -2,6 +2,89 @@
 <file path=word/document.xml><?xml version="1.0" encoding="utf-8"?>
 <w:document xmlns:wpc="http://schemas.microsoft.com/office/word/2010/wordprocessingCanvas" xmlns:cx="http://schemas.microsoft.com/office/drawing/2014/chartex" xmlns:cx1="http://schemas.microsoft.com/office/drawing/2015/9/8/chartex" xmlns:cx2="http://schemas.microsoft.com/office/drawing/2015/10/21/chartex" xmlns:cx3="http://schemas.microsoft.com/office/drawing/2016/5/9/chartex" xmlns:cx4="http://schemas.microsoft.com/office/drawing/2016/5/10/chartex" xmlns:cx5="http://schemas.microsoft.com/office/drawing/2016/5/11/chartex" xmlns:cx6="http://schemas.microsoft.com/office/drawing/2016/5/12/chartex" xmlns:cx7="http://schemas.microsoft.com/office/drawing/2016/5/13/chartex" xmlns:cx8="http://schemas.microsoft.com/office/drawing/2016/5/14/chartex" xmlns:mc="http://schemas.openxmlformats.org/markup-compatibility/2006" xmlns:aink="http://schemas.microsoft.com/office/drawing/2016/ink" xmlns:am3d="http://schemas.microsoft.com/office/drawing/2017/model3d" xmlns:o="urn:schemas-microsoft-com:office:office" xmlns:oel="http://schemas.microsoft.com/office/2019/extlst" xmlns:r="http://schemas.openxmlformats.org/officeDocument/2006/relationships" xmlns:m="http://schemas.openxmlformats.org/officeDocument/2006/math" xmlns:v="urn:schemas-microsoft-com:vml" xmlns:wp14="http://schemas.microsoft.com/office/word/2010/wordprocessingDrawing" xmlns:wp="http://schemas.openxmlformats.org/drawingml/2006/wordprocessingDrawing" xmlns:w10="urn:schemas-microsoft-com:office:word" xmlns:w="http://schemas.openxmlformats.org/wordprocessingml/2006/main" xmlns:w14="http://schemas.microsoft.com/office/word/2010/wordml" xmlns:w15="http://schemas.microsoft.com/office/word/2012/wordml" xmlns:w16cex="http://schemas.microsoft.com/office/word/2018/wordml/cex" xmlns:w16cid="http://schemas.microsoft.com/office/word/2016/wordml/cid" xmlns:w16="http://schemas.microsoft.com/office/word/2018/wordml" xmlns:w16du="http://schemas.microsoft.com/office/word/2023/wordml/word16du" xmlns:w16sdtdh="http://schemas.microsoft.com/office/word/2020/wordml/sdtdatahash" xmlns:w16sdtfl="http://schemas.microsoft.com/office/word/2024/wordml/sdtformatlock" xmlns:w16se="http://schemas.microsoft.com/office/word/2015/wordml/symex" xmlns:wpg="http://schemas.microsoft.com/office/word/2010/wordprocessingGroup" xmlns:wpi="http://schemas.microsoft.com/office/word/2010/wordprocessingInk" xmlns:wne="http://schemas.microsoft.com/office/word/2006/wordml" xmlns:wps="http://schemas.microsoft.com/office/word/2010/wordprocessingShape" mc:Ignorable="w14 w15 w16se w16cid w16 w16cex w16sdtdh w16sdtfl w16du wp14">
   <w:body>
+    <w:p>
+      <w:pPr>
+        <w:bidi/>
+        <w:jc w:val="center"/>
+        <w:rPr>
+          <w:rFonts w:hint="cs"/>
+          <w:b/>
+          <w:bCs/>
+          <w:sz w:val="28"/>
+          <w:szCs w:val="28"/>
+          <w:rtl/>
+        </w:rPr>
+      </w:pPr>
+      <w:r>
+        <w:rPr>
+          <w:rFonts w:hint="cs"/>
+          <w:b/>
+          <w:bCs/>
+          <w:sz w:val="28"/>
+          <w:szCs w:val="28"/>
+          <w:rtl/>
+        </w:rPr>
+        <w:t xml:space="preserve">الأستاذ {office_name}</w:t>
+      </w:r>
+    </w:p>
+    <w:p>
+      <w:pPr>
+        <w:jc w:val="center"/>
+        <w:rPr>
+          <w:sz w:val="22"/>
+          <w:szCs w:val="22"/>
+        </w:rPr>
+      </w:pPr>
+      <w:r>
+        <w:rPr>
+          <w:sz w:val="22"/>
+          <w:szCs w:val="22"/>
+        </w:rPr>
+        <w:t xml:space="preserve">{office_name_fr}</w:t>
+      </w:r>
+    </w:p>
+    <w:p>
+      <w:pPr>
+        <w:bidi/>
+        <w:jc w:val="center"/>
+        <w:rPr>
+          <w:rFonts w:hint="cs"/>
+          <w:sz w:val="18"/>
+          <w:szCs w:val="18"/>
+          <w:rtl/>
+        </w:rPr>
+      </w:pPr>
+      <w:r>
+        <w:rPr>
+          <w:rFonts w:hint="cs"/>
+          <w:sz w:val="18"/>
+          <w:szCs w:val="18"/>
+          <w:rtl/>
+        </w:rPr>
+        <w:t xml:space="preserve">الهاتف : {office_phone}   -   الفاكس : {office_fax}</w:t>
+      </w:r>
+    </w:p>
+    <w:p>
+      <w:pPr>
+        <w:bidi/>
+        <w:jc w:val="center"/>
+        <w:rPr>
+          <w:rFonts w:hint="cs"/>
+          <w:sz w:val="18"/>
+          <w:szCs w:val="18"/>
+          <w:rtl/>
+        </w:rPr>
+      </w:pPr>
+      <w:r>
+        <w:rPr>
+          <w:rFonts w:hint="cs"/>
+          <w:sz w:val="18"/>
+          <w:szCs w:val="18"/>
+          <w:rtl/>
+        </w:rPr>
+        <w:t xml:space="preserve">المعرّف الجبائي : {office_tax_id}   -   الحساب البنكي : {office_rib}   -   معرّف الصندوق : {office_cnss}</w:t>
+      </w:r>
+    </w:p>
     <w:p>
       <w:pPr>
         <w:bidi/>

</xml_diff>